<commit_message>
Assignment 7.2 and 8.2
</commit_message>
<xml_diff>
--- a/module-6/PMoracchini- Assignment_6.2.docx
+++ b/module-6/PMoracchini- Assignment_6.2.docx
@@ -23,13 +23,7 @@
         <w:spacing w:line="480" w:lineRule="auto"/>
       </w:pPr>
       <w:r>
-        <w:t>Nov</w:t>
-      </w:r>
-      <w:r>
-        <w:t xml:space="preserve"> 19</w:t>
-      </w:r>
-      <w:r>
-        <w:t>, 2025</w:t>
+        <w:t>Nov 19, 2025</w:t>
       </w:r>
     </w:p>
     <w:p>
@@ -117,21 +111,7 @@
           <w:b/>
           <w:bCs/>
         </w:rPr>
-        <w:t xml:space="preserve">Module  </w:t>
-      </w:r>
-      <w:r>
-        <w:rPr>
-          <w:b/>
-          <w:bCs/>
-        </w:rPr>
-        <w:t>6.2</w:t>
-      </w:r>
-      <w:r>
-        <w:rPr>
-          <w:b/>
-          <w:bCs/>
-        </w:rPr>
-        <w:t xml:space="preserve">  Assignment</w:t>
+        <w:t>Module  6.2  Assignment</w:t>
       </w:r>
     </w:p>
     <w:p>
@@ -511,6 +491,42 @@
           </wp:inline>
         </w:drawing>
       </w:r>
+    </w:p>
+    <w:p>
+      <w:pPr>
+        <w:spacing w:line="480" w:lineRule="auto"/>
+        <w:rPr>
+          <w:b/>
+          <w:bCs/>
+          <w:u w:val="single"/>
+        </w:rPr>
+      </w:pPr>
+      <w:r>
+        <w:rPr>
+          <w:b/>
+          <w:bCs/>
+          <w:u w:val="single"/>
+        </w:rPr>
+        <w:t>Link to GitHub</w:t>
+      </w:r>
+    </w:p>
+    <w:p>
+      <w:pPr>
+        <w:spacing w:line="480" w:lineRule="auto"/>
+      </w:pPr>
+      <w:hyperlink r:id="rId8" w:history="1">
+        <w:r>
+          <w:rPr>
+            <w:rStyle w:val="Hyperlink"/>
+          </w:rPr>
+          <w:t>https://github.com/Bellevuestudent/csd-310.git</w:t>
+        </w:r>
+      </w:hyperlink>
+    </w:p>
+    <w:p>
+      <w:pPr>
+        <w:spacing w:line="480" w:lineRule="auto"/>
+      </w:pPr>
     </w:p>
     <w:sectPr>
       <w:pgSz w:w="12240" w:h="15840"/>
@@ -1118,6 +1134,7 @@
   <w:style w:type="character" w:default="1" w:styleId="DefaultParagraphFont">
     <w:name w:val="Default Paragraph Font"/>
     <w:uiPriority w:val="1"/>
+    <w:semiHidden/>
     <w:unhideWhenUsed/>
   </w:style>
   <w:style w:type="table" w:default="1" w:styleId="TableNormal">
@@ -1430,6 +1447,29 @@
       <w:smallCaps/>
       <w:color w:val="0F4761" w:themeColor="accent1" w:themeShade="BF"/>
       <w:spacing w:val="5"/>
+    </w:rPr>
+  </w:style>
+  <w:style w:type="character" w:styleId="Hyperlink">
+    <w:name w:val="Hyperlink"/>
+    <w:basedOn w:val="DefaultParagraphFont"/>
+    <w:uiPriority w:val="99"/>
+    <w:unhideWhenUsed/>
+    <w:rsid w:val="00327DDD"/>
+    <w:rPr>
+      <w:color w:val="467886" w:themeColor="hyperlink"/>
+      <w:u w:val="single"/>
+    </w:rPr>
+  </w:style>
+  <w:style w:type="character" w:styleId="UnresolvedMention">
+    <w:name w:val="Unresolved Mention"/>
+    <w:basedOn w:val="DefaultParagraphFont"/>
+    <w:uiPriority w:val="99"/>
+    <w:semiHidden/>
+    <w:unhideWhenUsed/>
+    <w:rsid w:val="00327DDD"/>
+    <w:rPr>
+      <w:color w:val="605E5C"/>
+      <w:shd w:val="clear" w:color="auto" w:fill="E1DFDD"/>
     </w:rPr>
   </w:style>
 </w:styles>

</xml_diff>